<commit_message>
chore: rebuild resume.docx from resume.json
</commit_message>
<xml_diff>
--- a/resume.docx
+++ b/resume.docx
@@ -36,7 +36,7 @@
       <w:pPr>
         <w:spacing w:after="200" w:before="0"/>
       </w:pPr>
-      <w:hyperlink w:history="1" r:id="rId7kb7jizigecxvfidf3c51">
+      <w:hyperlink w:history="1" r:id="rId0rhjal_3gzncc0jzuphx0">
         <w:r>
           <w:rPr>
             <w:rFonts w:ascii="Arial" w:cs="Arial" w:eastAsia="Arial" w:hAnsi="Arial"/>
@@ -318,7 +318,7 @@
                 <w:sz w:val="19"/>
                 <w:szCs w:val="19"/>
               </w:rPr>
-              <w:t xml:space="preserve">PostgreSQL  ·  MongoDB  ·  Neo4j  ·  SQL (relational design)</w:t>
+              <w:t xml:space="preserve">PostgreSQL  ·  SQLite  ·  MongoDB  ·  Neo4j  ·  SQL (relational design)</w:t>
             </w:r>
           </w:p>
         </w:tc>
@@ -446,7 +446,7 @@
                 <w:sz w:val="19"/>
                 <w:szCs w:val="19"/>
               </w:rPr>
-              <w:t xml:space="preserve">Git  ·  Linux  ·  GitHub Pages  ·  .NET / Visual Studio  ·  Jira</w:t>
+              <w:t xml:space="preserve">Git  ·  Docker  ·  Linux  ·  GitHub Pages  ·  .NET / Visual Studio  ·  Jira</w:t>
             </w:r>
           </w:p>
         </w:tc>
@@ -562,7 +562,7 @@
         </w:rPr>
         <w:t xml:space="preserve">	</w:t>
       </w:r>
-      <w:hyperlink w:history="1" r:id="rIdndgah3d9ykjvxlvzaiij4">
+      <w:hyperlink w:history="1" r:id="rIdhzgrgyoixlsb8ivsovdxt">
         <w:r>
           <w:rPr>
             <w:rFonts w:ascii="Arial" w:cs="Arial" w:eastAsia="Arial" w:hAnsi="Arial"/>
@@ -706,7 +706,7 @@
         </w:rPr>
         <w:t xml:space="preserve">	</w:t>
       </w:r>
-      <w:hyperlink w:history="1" r:id="rId3ep646yam1j-mvlwmh2pu">
+      <w:hyperlink w:history="1" r:id="rIdg2tnhoanvnjhutnpddi1z">
         <w:r>
           <w:rPr>
             <w:rFonts w:ascii="Arial" w:cs="Arial" w:eastAsia="Arial" w:hAnsi="Arial"/>
@@ -831,7 +831,7 @@
         </w:rPr>
         <w:t xml:space="preserve">	</w:t>
       </w:r>
-      <w:hyperlink w:history="1" r:id="rIdrgeolm5yv4hqj9euyhguw">
+      <w:hyperlink w:history="1" r:id="rId6qp0om4owbb_y0xxtzoin">
         <w:r>
           <w:rPr>
             <w:rFonts w:ascii="Arial" w:cs="Arial" w:eastAsia="Arial" w:hAnsi="Arial"/>
@@ -851,7 +851,7 @@
         </w:rPr>
         <w:t xml:space="preserve">  </w:t>
       </w:r>
-      <w:hyperlink w:history="1" r:id="rId8xofr83gdich1yken4rle">
+      <w:hyperlink w:history="1" r:id="rIdcxbfsbnx863wzwoskmnla">
         <w:r>
           <w:rPr>
             <w:rFonts w:ascii="Arial" w:cs="Arial" w:eastAsia="Arial" w:hAnsi="Arial"/>
@@ -871,7 +871,7 @@
         </w:rPr>
         <w:t xml:space="preserve">  </w:t>
       </w:r>
-      <w:hyperlink w:history="1" r:id="rIdoixorw3zhhwyfuimvfy2w">
+      <w:hyperlink w:history="1" r:id="rIdrszn6w4dub9jngoxldain">
         <w:r>
           <w:rPr>
             <w:rFonts w:ascii="Arial" w:cs="Arial" w:eastAsia="Arial" w:hAnsi="Arial"/>
@@ -1015,7 +1015,7 @@
         </w:rPr>
         <w:t xml:space="preserve">	</w:t>
       </w:r>
-      <w:hyperlink w:history="1" r:id="rIdhg8sxudedbb-thawcpc5k">
+      <w:hyperlink w:history="1" r:id="rIdgbxwlpzf7ij7kxkmc_yb0">
         <w:r>
           <w:rPr>
             <w:rFonts w:ascii="Arial" w:cs="Arial" w:eastAsia="Arial" w:hAnsi="Arial"/>
@@ -1035,7 +1035,7 @@
         </w:rPr>
         <w:t xml:space="preserve">  </w:t>
       </w:r>
-      <w:hyperlink w:history="1" r:id="rIdbvu5eurixo73kpsuq8cv5">
+      <w:hyperlink w:history="1" r:id="rIdpkpo0rzntda_bejj5igtp">
         <w:r>
           <w:rPr>
             <w:rFonts w:ascii="Arial" w:cs="Arial" w:eastAsia="Arial" w:hAnsi="Arial"/>
@@ -1179,7 +1179,7 @@
         </w:rPr>
         <w:t xml:space="preserve">	</w:t>
       </w:r>
-      <w:hyperlink w:history="1" r:id="rIdum7b1fik6uetd9njmrqzc">
+      <w:hyperlink w:history="1" r:id="rIdbb6qhptjofwccb-s0oluw">
         <w:r>
           <w:rPr>
             <w:rFonts w:ascii="Arial" w:cs="Arial" w:eastAsia="Arial" w:hAnsi="Arial"/>
@@ -1304,7 +1304,7 @@
         </w:rPr>
         <w:t xml:space="preserve">	</w:t>
       </w:r>
-      <w:hyperlink w:history="1" r:id="rIdlqorx3vh-oicrvcvmzq25">
+      <w:hyperlink w:history="1" r:id="rIdzofohzfdzxdsrn8rnzngt">
         <w:r>
           <w:rPr>
             <w:rFonts w:ascii="Arial" w:cs="Arial" w:eastAsia="Arial" w:hAnsi="Arial"/>
@@ -1446,7 +1446,7 @@
         </w:rPr>
         <w:t xml:space="preserve">	</w:t>
       </w:r>
-      <w:hyperlink w:history="1" r:id="rId6fjct85vsr5ktv5jxuj84">
+      <w:hyperlink w:history="1" r:id="rIdglzfxppv5hjfciccl3t3q">
         <w:r>
           <w:rPr>
             <w:rFonts w:ascii="Arial" w:cs="Arial" w:eastAsia="Arial" w:hAnsi="Arial"/>
@@ -1571,7 +1571,7 @@
         </w:rPr>
         <w:t xml:space="preserve">	</w:t>
       </w:r>
-      <w:hyperlink w:history="1" r:id="rIdzlzidfigv-py2xof5fykr">
+      <w:hyperlink w:history="1" r:id="rIdg6igtvzhvzetnqxrrqka5">
         <w:r>
           <w:rPr>
             <w:rFonts w:ascii="Arial" w:cs="Arial" w:eastAsia="Arial" w:hAnsi="Arial"/>
@@ -1658,7 +1658,7 @@
         </w:rPr>
         <w:t xml:space="preserve">	</w:t>
       </w:r>
-      <w:hyperlink w:history="1" r:id="rIdxeonsgack9gkh-giegsps">
+      <w:hyperlink w:history="1" r:id="rId3yb_sgz9istfqmy6phkmn">
         <w:r>
           <w:rPr>
             <w:rFonts w:ascii="Arial" w:cs="Arial" w:eastAsia="Arial" w:hAnsi="Arial"/>
@@ -1745,7 +1745,7 @@
         </w:rPr>
         <w:t xml:space="preserve">	</w:t>
       </w:r>
-      <w:hyperlink w:history="1" r:id="rIdbhie-pvh74f9hcoefxnuw">
+      <w:hyperlink w:history="1" r:id="rIdhnqiwzrs3wasf4cc3zdlz">
         <w:r>
           <w:rPr>
             <w:rFonts w:ascii="Arial" w:cs="Arial" w:eastAsia="Arial" w:hAnsi="Arial"/>
@@ -1870,7 +1870,7 @@
         </w:rPr>
         <w:t xml:space="preserve">	</w:t>
       </w:r>
-      <w:hyperlink w:history="1" r:id="rIdlu-rhzvnmm2aezrrlgqe2">
+      <w:hyperlink w:history="1" r:id="rIdz3huy1vj_00q7iueclfiw">
         <w:r>
           <w:rPr>
             <w:rFonts w:ascii="Arial" w:cs="Arial" w:eastAsia="Arial" w:hAnsi="Arial"/>
@@ -1995,7 +1995,7 @@
         </w:rPr>
         <w:t xml:space="preserve">	</w:t>
       </w:r>
-      <w:hyperlink w:history="1" r:id="rId9m2aa-9pfx0gcl9tonfgd">
+      <w:hyperlink w:history="1" r:id="rId2c1y0dyau5vcn75hnmofm">
         <w:r>
           <w:rPr>
             <w:rFonts w:ascii="Arial" w:cs="Arial" w:eastAsia="Arial" w:hAnsi="Arial"/>
@@ -2101,7 +2101,7 @@
         </w:rPr>
         <w:t xml:space="preserve">	</w:t>
       </w:r>
-      <w:hyperlink w:history="1" r:id="rIdqqh5dclxwcejducdpqzww">
+      <w:hyperlink w:history="1" r:id="rIdkpezr8c9c8sv4cl7vfhg8">
         <w:r>
           <w:rPr>
             <w:rFonts w:ascii="Arial" w:cs="Arial" w:eastAsia="Arial" w:hAnsi="Arial"/>

</xml_diff>